<commit_message>
paper(word): align abstracts introduction and scientific wording
</commit_message>
<xml_diff>
--- a/submissions/arocmag/word-final/K-Waay-AROCMAG-submission-working.docx
+++ b/submissions/arocmag/word-final/K-Waay-AROCMAG-submission-working.docx
@@ -16,25 +16,7 @@
           <w:color w:val="000000"/>
           <w:sz w:val="32"/>
         </w:rPr>
-        <w:t>K-Waay批次准入中参与方互异条件的形式化分析</w:t>
-      </w:r>
-    </w:p>
-    <w:p>
-      <w:pPr>
-        <w:pStyle w:val="77"/>
-        <w:keepNext/>
-        <w:spacing w:before="0" w:after="20"/>
-        <w:jc w:val="center"/>
-      </w:pPr>
-      <w:r>
-        <w:rPr>
-          <w:rFonts w:ascii="Times New Roman" w:hAnsi="Times New Roman" w:eastAsia="宋体"/>
-          <w:b/>
-          <w:i w:val="0"/>
-          <w:color w:val="000000"/>
-          <w:sz w:val="16"/>
-        </w:rPr>
-        <w:t>部分更新工作稿：第1、2章已更新；后续章节尚待衔接；非最终可投稿版本。</w:t>
+        <w:t xml:space="preserve">K-Waay 接收端安全问题的形式化分析与组合加固</w:t>
       </w:r>
     </w:p>
     <w:p>
@@ -79,22 +61,22 @@
       <w:r>
         <w:rPr>
           <w:rFonts w:ascii="Times New Roman" w:hAnsi="Times New Roman" w:eastAsia="宋体"/>
-          <w:b/>
-          <w:i w:val="0"/>
-          <w:color w:val="000000"/>
-          <w:sz w:val="18"/>
-        </w:rPr>
-        <w:t>摘  要：</w:t>
-      </w:r>
-      <w:r>
-        <w:rPr>
-          <w:rFonts w:ascii="Times New Roman" w:hAnsi="Times New Roman" w:eastAsia="宋体"/>
-          <w:b w:val="0"/>
-          <w:i w:val="0"/>
-          <w:color w:val="000000"/>
-          <w:sz w:val="18"/>
-        </w:rPr>
-        <w:t>K-Waay的BatchReceive 要求同次调用中的输入元素分别对应不同参与方，但消息限制能否替代该条件需验证。基于共同生命周期构造无互异、消息互异和参与方互异三种固定两槽Tamarin准入模型。无互异模型允许一个匹配发送来源对应同批两个接受；人工语义推导表明，新鲜消息和精确来源匹配使消息互异性与批内来源单射性等价。机器可达见证显示，同一参与方的不同发送实例与消息各有匹配发送来源，可同批接受，故消息约束不能推出参与方互异性。参与方互异约束模型保持目标关系，有效批次可达。结论限于固定两槽准入抽象。</w:t>
+          <w:b w:val="1"/>
+          <w:i w:val="0"/>
+          <w:color w:val="000000"/>
+          <w:sz w:val="18"/>
+        </w:rPr>
+        <w:t xml:space="preserve">摘 要：</w:t>
+      </w:r>
+      <w:r>
+        <w:rPr>
+          <w:rFonts w:ascii="Times New Roman" w:hAnsi="Times New Roman" w:eastAsia="宋体"/>
+          <w:b w:val="0"/>
+          <w:i w:val="0"/>
+          <w:color w:val="000000"/>
+          <w:sz w:val="18"/>
+        </w:rPr>
+        <w:t xml:space="preserve"> 针对 K-Waay 会话参数失配与批内重复接受问题，利用 ProVerif 和 Tamarin 分析核心交换与 BatchReceive。发现攻击者复用合法 split-KEM 密文、重构其他 KEM 密文，可使接收方在会话密钥未泄露时接受与发送方密钥不一致的会话。HMAC 密钥确认使无泄露模型中的完整参数对应关系由不成立转为成立。在未维持参与方互异条件的两槽模型中，合法确认消息仍可被重复接受；独立消费模型进一步验证了条件化重复符号安装。为此，提出处理前的批内原子消息去重，并与 HMAC 确认组合。验证表明，批内重复接受及条件化重复安装被阻断，批内接收单射性成立，正常批次处理与输出消费仍可达。</w:t>
       </w:r>
     </w:p>
     <w:p>
@@ -105,22 +87,22 @@
       <w:r>
         <w:rPr>
           <w:rFonts w:ascii="Times New Roman" w:hAnsi="Times New Roman" w:eastAsia="宋体"/>
-          <w:b/>
-          <w:i w:val="0"/>
-          <w:color w:val="000000"/>
-          <w:sz w:val="18"/>
-        </w:rPr>
-        <w:t>关键词：</w:t>
-      </w:r>
-      <w:r>
-        <w:rPr>
-          <w:rFonts w:ascii="Times New Roman" w:hAnsi="Times New Roman" w:eastAsia="宋体"/>
-          <w:b w:val="0"/>
-          <w:i w:val="0"/>
-          <w:color w:val="000000"/>
-          <w:sz w:val="18"/>
-        </w:rPr>
-        <w:t>K-Waay；批次准入；批内参与方互异条件；Tamarin；形式化验证</w:t>
+          <w:b w:val="1"/>
+          <w:i w:val="0"/>
+          <w:color w:val="000000"/>
+          <w:sz w:val="18"/>
+        </w:rPr>
+        <w:t xml:space="preserve">关键词：</w:t>
+      </w:r>
+      <w:r>
+        <w:rPr>
+          <w:rFonts w:ascii="Times New Roman" w:hAnsi="Times New Roman" w:eastAsia="宋体"/>
+          <w:b w:val="0"/>
+          <w:i w:val="0"/>
+          <w:color w:val="000000"/>
+          <w:sz w:val="18"/>
+        </w:rPr>
+        <w:t xml:space="preserve"> K-Waay；密文重组攻击；批内重放；HMAC 密钥确认；原子去重；ProVerif；Tamarin</w:t>
       </w:r>
     </w:p>
     <w:p>
@@ -153,7 +135,7 @@
           <w:color w:val="000000"/>
           <w:sz w:val="24"/>
         </w:rPr>
-        <w:t>Formal Analysis of the Distinct-Party Condition in K-Waay Batch Admission</w:t>
+        <w:t xml:space="preserve">Formal Analysis and Combined Hardening of Receiver-Side Security in K-Waay</w:t>
       </w:r>
     </w:p>
     <w:p>
@@ -197,12 +179,12 @@
       <w:r>
         <w:rPr>
           <w:rFonts w:ascii="Times New Roman" w:hAnsi="Times New Roman" w:eastAsia="宋体"/>
-          <w:b/>
+          <w:b w:val="1"/>
           <w:i w:val="0"/>
           <w:color w:val="000000"/>
           <w:sz w:val="17"/>
         </w:rPr>
-        <w:t xml:space="preserve">Abstract: </w:t>
+        <w:t xml:space="preserve">Abstract:</w:t>
       </w:r>
       <w:r>
         <w:rPr>
@@ -212,7 +194,7 @@
           <w:color w:val="000000"/>
           <w:sz w:val="17"/>
         </w:rPr>
-        <w:t>K-Waay requires inputs to one BatchReceive invocation to correspond to different parties, but whether message distinction can replace this same-batch condition requires verification. Three fixed-two-slot Tamarin admission models—unconstrained, message-constrained, and party-constrained—were constructed over a common lifecycle. The unconstrained model admitted two same-batch acceptance events supported by one matching sender origin. A manual semantic derivation under the fresh-message and exact-origin rules showed that same-batch message distinction and batch-scoped origin injectivity are equivalent in the message-constrained model. A machine-reachable execution nevertheless contained two distinct sender occurrences and messages from the same party, each with its own matching sender origin; both entered one batch and yielded two ReceiverAccept events. Thus message distinction does not imply same-batch party distinction. The party-constrained model preserved the target relation while retaining reachable valid distinct-party batches. These conclusions are limited to the fixed-two-slot batch-admission abstraction.</w:t>
+        <w:t xml:space="preserve"> Receiver-side session mismatch and intra-batch duplicate acceptance in K-Waay were analyzed using ProVerif and Tamarin. The analysis identified a ciphertext recomposition attack: an adversary could reuse a legitimate split-KEM ciphertext and reconstruct other KEM ciphertexts, causing the receiver to accept a session key different from the sender's without learning that key. HMAC-based key confirmation restored full-parameter correspondence in the uncompromised symbolic model. However, when the distinct-party precondition was not maintained, a valid confirmed message could still be accepted twice within a two-slot batch. A separate output-consumption model further demonstrated conditional duplicate symbolic installations. An atomic, batch-local message deduplication mechanism was therefore proposed and combined with HMAC confirmation. Verification showed that duplicate acceptance and conditional duplicate installation were prevented, while batch-scoped acceptance injectivity and normal batch processing and output consumption remained achievable.</w:t>
       </w:r>
     </w:p>
     <w:p>
@@ -224,12 +206,12 @@
       <w:r>
         <w:rPr>
           <w:rFonts w:ascii="Times New Roman" w:hAnsi="Times New Roman" w:eastAsia="宋体"/>
-          <w:b/>
+          <w:b w:val="1"/>
           <w:i w:val="0"/>
           <w:color w:val="000000"/>
           <w:sz w:val="17"/>
         </w:rPr>
-        <w:t xml:space="preserve">Key words: </w:t>
+        <w:t xml:space="preserve">Key words:</w:t>
       </w:r>
       <w:r>
         <w:rPr>
@@ -239,7 +221,7 @@
           <w:color w:val="000000"/>
           <w:sz w:val="17"/>
         </w:rPr>
-        <w:t>K-Waay; batch admission; distinct-party condition; Tamarin; formal verification</w:t>
+        <w:t xml:space="preserve"> K-Waay; ciphertext recomposition attack; intra-batch replay; HMAC-based key confirmation; atomic deduplication; ProVerif; Tamarin</w:t>
       </w:r>
     </w:p>
     <w:p>
@@ -290,7 +272,7 @@
           <w:color w:val="000000"/>
           <w:sz w:val="18"/>
         </w:rPr>
-        <w:t>后量子安全消息协议的分析通常围绕单次握手、单条消息或单个会话展开，而异步接收接口还可能将多个发送方关联输入组合为一次处理。单个条目的来源性质只能描述该条目，不能据此确定同批条目之间应满足的关系。安全消息的会话组合研究同样表明，组合边界可能承担独立于组件性质的安全义务[1]。因此，批次准入中的条目关系需要作为单独的分析对象。</w:t>
+        <w:t xml:space="preserve">随着后量子密码技术的发展，安全消息协议逐渐采用基于密钥封装机制（Key Encapsulation Mechanism，KEM）的密钥交换方案，以应对量子计算对传统公钥密码体系的潜在威胁。K-Waay 是一种面向异步通信的后量子可否认认证密钥交换协议，通过 KEM、数字签名与 split-KEM 实现类似 X3DH 的密钥交换功能[2-3]。该协议支持发送方离线发起会话，并通过 BatchReceive 机制处理多个发送方使用同一接收方临时状态生成的消息。然而，接收方能否正确确认完整会话参数，以及批量处理过程中是否存在重复接受行为，仍需要结合具体接收流程进行分析。</w:t>
       </w:r>
     </w:p>
     <w:p>
@@ -308,7 +290,7 @@
           <w:color w:val="000000"/>
           <w:sz w:val="18"/>
         </w:rPr>
-        <w:t>K-Waay 是一种后量子、类似X3DH的可否认认证密钥交换协议[2]。其BatchReceive 操作在共享接收方状态下处理多个发送方关联输入；原文第5.1节（第21页）明确要求同一次调用中的元素对应不同参与方[3]。下文将这一要求称为批内参与方互异条件（distinct-party condition）。分析并非寻找协议规范遗漏的条件，而是考察该条件维护的批内关系，以及在条目均具有模型内匹配发送来源时，其他准入限制能否推出这一关系。</w:t>
+        <w:t xml:space="preserve">已有研究对安全消息协议的认证与密钥安全性进行了深入分析。例如，Signal 协议的形式化研究系统考察了密钥交换及后续消息处理中的安全性质[4]，PQXDH 的形式化验证进一步研究了后量子密钥协商的认证和机密性[5]。这些研究为分析后量子消息协议提供了方法基础，但密钥机密性、发送与接收会话参数一致性以及批次内部的接收唯一性是不同的安全目标。尤其对于采用多个密码分量构造会话密钥的协议，单个分量的来源合法性并不必然意味着接收方接受的完整消息与发送方实际生成的消息一致；对于批量接收机制，单条消息的有效性验证也不能直接保证该消息不会被重复处理。</w:t>
       </w:r>
     </w:p>
     <w:p>
@@ -326,7 +308,7 @@
           <w:color w:val="000000"/>
           <w:sz w:val="18"/>
         </w:rPr>
-        <w:t>已有安全消息协议分析为研究提供了方法基础，但其主要分析对象与批内关系不同。Signal的形式化分析将X3DH和Double Ratchet建模为多阶段认证密钥交换，研究会话中的密钥安全；PQXDH的分析使用ProVerif和CryptoVerif考察认证、机密性、后量子前向安全及共同部署[4,5]。本文使用Tamarin的多集重写与迹性质验证方法[6]，抽取一次接收调用内的条目组合关系，不重复验证上述密码过程，也不由批次见证推断其密钥安全结论失效。</w:t>
+        <w:t xml:space="preserve">针对上述问题，本文首先利用 ProVerif 对 K-Waay 核心密钥交换过程进行形式化分析，发现一条密文重组攻击路径。攻击者能够保留合法发送方产生的 split-KEM 密文，同时利用公开密钥重新构造其他 KEM 密文，使接收方在成功解封装后接受篡改消息，进而导出与发送方不同的会话标识及会话密钥。该攻击不需要获得接收方会话密钥，说明会话密钥机密性成立并不足以保证双方会话参数一致。为阻断该攻击，本文提出基于 HMAC 的密钥确认机制，使接收方在完成接收前验证由会话密钥及完整转录本标识生成的确认标签。</w:t>
       </w:r>
     </w:p>
     <w:p>
@@ -344,7 +326,7 @@
           <w:color w:val="000000"/>
           <w:sz w:val="18"/>
         </w:rPr>
-        <w:t>身份名称与认证事件对应关系也有既有理论基础。Lupetti等讨论了名称在相关会话范围内的唯一性及其协议语义[7]；Lowe的认证层次区分非单射一致性与单射一致性等性质[8]。本文假设参与方投影已正确建立，比较的是同一批次不同位置上的投影是否相同；所检查的来源单射性仅约束给定批次上下文内的发送—接受事件对应。因此，该问题既不是名称解释歧义，也不是重新提出身份唯一性或认证单射性理论。</w:t>
+        <w:t xml:space="preserve">进一步地，本文使用 Tamarin 分析 K-Waay 的 BatchReceive 机制，发现在参与方互异前置条件未得到维持的情况下，即使消息已经通过 HMAC 确认，攻击者仍能够将同一合法消息重复投递至同一批次的不同槽位，造成一个发送会话对应多个接收事件。在逐输出独立消费的条件下，重复接收还可能进一步产生具有相同会话参数的多个本地安装事件。针对这一问题，本文提出处理前批内原子消息去重机制，并与 HMAC 确认相结合，在消息接受之前统一检查重复输入，从而实现会话参数确认与批内接收唯一性的分层保护。</w:t>
       </w:r>
     </w:p>
     <w:p>
@@ -362,61 +344,7 @@
           <w:color w:val="000000"/>
           <w:sz w:val="18"/>
         </w:rPr>
-        <w:t>在组合层面，Cremers等分析多条棘轮会话链如何被管理和合并为会话交谈，说明单条链的性质不能直接代替交谈层面的失陷后安全分析[1]。本文沿用将组合边界单独建模的思路，但对象是一次BatchReceive 的输入条目及其参与方投影，而非多会话管理。研究区别在于：针对K-Waay已声明的批内条件，在相同生命周期下比较消息级限制与参与方级限制，并验证相关条目能否实际到达接受边界。</w:t>
-      </w:r>
-    </w:p>
-    <w:p>
-      <w:pPr>
-        <w:pStyle w:val="71"/>
-        <w:spacing w:before="0" w:after="0" w:line="240" w:lineRule="exact"/>
-        <w:ind w:firstLine="360"/>
-        <w:jc w:val="both"/>
-      </w:pPr>
-      <w:r>
-        <w:rPr>
-          <w:rFonts w:ascii="Times New Roman" w:hAnsi="Times New Roman" w:eastAsia="宋体"/>
-          <w:b w:val="0"/>
-          <w:i w:val="0"/>
-          <w:color w:val="000000"/>
-          <w:sz w:val="18"/>
-        </w:rPr>
-        <w:t>同一参与方可以通过不同发送实例产生不同消息，因而批内消息互异性、发送—接受事件的单射关系和批内参与方互异性比较的是不同对象。静态地指出这些对象不同，并不能说明相应条目能否经过来源匹配、批次准入和顺序处理并产生接受事件。为此，需要回答三个相互关联的问题：移除目标条件后，重复参与方条目能否进入同一批次；一个完整元组的匹配发送来源能否对应同批两个接受事件；消息互异约束能否排除同一参与方的不同消息共同进入批次。研究边界限定在固定两槽的批次准入抽象，不将模型结果解释为完整K-Waay攻击或部署缺陷。</w:t>
-      </w:r>
-    </w:p>
-    <w:p>
-      <w:pPr>
-        <w:pStyle w:val="71"/>
-        <w:spacing w:before="0" w:after="0" w:line="240" w:lineRule="exact"/>
-        <w:ind w:firstLine="360"/>
-        <w:jc w:val="both"/>
-      </w:pPr>
-      <w:r>
-        <w:rPr>
-          <w:rFonts w:ascii="Times New Roman" w:hAnsi="Times New Roman" w:eastAsia="宋体"/>
-          <w:b w:val="0"/>
-          <w:i w:val="0"/>
-          <w:color w:val="000000"/>
-          <w:sz w:val="18"/>
-        </w:rPr>
-        <w:t>为控制流程差异，三个模型共用发送、网络暴露、两槽收集、来源匹配和顺序处理生命周期，仅改变准入约束。无互异约束模型用于观察移除目标条件后的行为；消息互异约束模型检验消息关系能否替代参与方关系；参与方互异约束模型直接施加目标约束，作为目标对照（positive control）。验证结果表明，无互异约束模型允许一个匹配发送来源对应同批两个接受事件；消息互异约束模型虽保持消息互异性和批内来源单射性，同一参与方的不同消息仍可在同批被接受；目标对照则保持批内参与方互异性，且有效的不同参与方批次可达。</w:t>
-      </w:r>
-    </w:p>
-    <w:p>
-      <w:pPr>
-        <w:pStyle w:val="71"/>
-        <w:spacing w:before="0" w:after="0" w:line="240" w:lineRule="exact"/>
-        <w:ind w:firstLine="360"/>
-        <w:jc w:val="both"/>
-      </w:pPr>
-      <w:r>
-        <w:rPr>
-          <w:rFonts w:ascii="Times New Roman" w:hAnsi="Times New Roman" w:eastAsia="宋体"/>
-          <w:b w:val="0"/>
-          <w:i w:val="0"/>
-          <w:color w:val="000000"/>
-          <w:sz w:val="18"/>
-        </w:rPr>
-        <w:t>本文的主要贡献如下：</w:t>
+        <w:t xml:space="preserve">本文主要贡献如下：</w:t>
       </w:r>
     </w:p>
     <w:p>
@@ -429,21 +357,29 @@
       <w:r>
         <w:rPr>
           <w:rFonts w:ascii="Times New Roman" w:hAnsi="Times New Roman" w:eastAsia="宋体"/>
-          <w:b/>
-          <w:color w:val="000000"/>
-          <w:sz w:val="18"/>
-        </w:rPr>
-        <w:t xml:space="preserve">1) </w:t>
-      </w:r>
-      <w:r>
-        <w:rPr>
-          <w:rFonts w:ascii="Times New Roman" w:hAnsi="Times New Roman" w:eastAsia="宋体"/>
-          <w:b w:val="0"/>
-          <w:i w:val="0"/>
-          <w:color w:val="000000"/>
-          <w:sz w:val="18"/>
-        </w:rPr>
-        <w:t>从BatchReceive 接口建立有明确省略边界的协议到模型映射，形式化刻画批内参与方互异条件，并区分参与方、发送实例和消息三个比较维度；</w:t>
+          <w:b w:val="0"/>
+          <w:color w:val="000000"/>
+          <w:sz w:val="18"/>
+        </w:rPr>
+        <w:t xml:space="preserve">1. </w:t>
+      </w:r>
+      <w:r>
+        <w:rPr>
+          <w:rFonts w:ascii="Times New Roman" w:hAnsi="Times New Roman" w:eastAsia="宋体"/>
+          <w:b w:val="1"/>
+          <w:color w:val="000000"/>
+          <w:sz w:val="18"/>
+        </w:rPr>
+        <w:t xml:space="preserve">发现 K-Waay 核心消息篡改攻击并提出修复方案。</w:t>
+      </w:r>
+      <w:r>
+        <w:rPr>
+          <w:rFonts w:ascii="Times New Roman" w:hAnsi="Times New Roman" w:eastAsia="宋体"/>
+          <w:b w:val="0"/>
+          <w:color w:val="000000"/>
+          <w:sz w:val="18"/>
+        </w:rPr>
+        <w:t xml:space="preserve"> 通过 ProVerif 构造密文重组攻击，揭示接收方在会话密钥未泄露的情况下仍可能接受失配会话的问题；提出 HMAC 密钥确认机制，并验证其能够恢复无泄露模型中的完整会话参数对应关系。</w:t>
       </w:r>
     </w:p>
     <w:p>
@@ -456,21 +392,29 @@
       <w:r>
         <w:rPr>
           <w:rFonts w:ascii="Times New Roman" w:hAnsi="Times New Roman" w:eastAsia="宋体"/>
-          <w:b/>
-          <w:color w:val="000000"/>
-          <w:sz w:val="18"/>
-        </w:rPr>
-        <w:t xml:space="preserve">2) </w:t>
-      </w:r>
-      <w:r>
-        <w:rPr>
-          <w:rFonts w:ascii="Times New Roman" w:hAnsi="Times New Roman" w:eastAsia="宋体"/>
-          <w:b w:val="0"/>
-          <w:i w:val="0"/>
-          <w:color w:val="000000"/>
-          <w:sz w:val="18"/>
-        </w:rPr>
-        <w:t>在共同的两槽生命周期上构造三种受控准入模型，比较消息互异约束与参与方互异约束的作用，并用发送来源对应性和批内来源单射性描述发送—接受事件关系；通过14项性质及独立复核记录给出可核查的比较证据；</w:t>
+          <w:b w:val="0"/>
+          <w:color w:val="000000"/>
+          <w:sz w:val="18"/>
+        </w:rPr>
+        <w:t xml:space="preserve">2. </w:t>
+      </w:r>
+      <w:r>
+        <w:rPr>
+          <w:rFonts w:ascii="Times New Roman" w:hAnsi="Times New Roman" w:eastAsia="宋体"/>
+          <w:b w:val="1"/>
+          <w:color w:val="000000"/>
+          <w:sz w:val="18"/>
+        </w:rPr>
+        <w:t xml:space="preserve">发现 HMAC 确认后的批内重复接受问题并分析安全影响。</w:t>
+      </w:r>
+      <w:r>
+        <w:rPr>
+          <w:rFonts w:ascii="Times New Roman" w:hAnsi="Times New Roman" w:eastAsia="宋体"/>
+          <w:b w:val="0"/>
+          <w:color w:val="000000"/>
+          <w:sz w:val="18"/>
+        </w:rPr>
+        <w:t xml:space="preserve"> 利用 Tamarin 构造合法确认消息的批内重放路径，证明同一发送消息能够对应两个不同接收事件，并在独立的条件化消费模型中验证重复接收可能造成的重复安装后果。</w:t>
       </w:r>
     </w:p>
     <w:p>
@@ -483,21 +427,29 @@
       <w:r>
         <w:rPr>
           <w:rFonts w:ascii="Times New Roman" w:hAnsi="Times New Roman" w:eastAsia="宋体"/>
-          <w:b/>
-          <w:color w:val="000000"/>
-          <w:sz w:val="18"/>
-        </w:rPr>
-        <w:t xml:space="preserve">3) </w:t>
-      </w:r>
-      <w:r>
-        <w:rPr>
-          <w:rFonts w:ascii="Times New Roman" w:hAnsi="Times New Roman" w:eastAsia="宋体"/>
-          <w:b w:val="0"/>
-          <w:i w:val="0"/>
-          <w:color w:val="000000"/>
-          <w:sz w:val="18"/>
-        </w:rPr>
-        <w:t>给出并机器验证消息级限制不能替代参与方关系的完整可达见证：同一参与方的不同发送实例和消息各有匹配发送来源，经过共同批次生命周期后产生两个接受事件；同时利用目标对照确认批内参与方互异性成立且有效批次可达。</w:t>
+          <w:b w:val="0"/>
+          <w:color w:val="000000"/>
+          <w:sz w:val="18"/>
+        </w:rPr>
+        <w:t xml:space="preserve">3. </w:t>
+      </w:r>
+      <w:r>
+        <w:rPr>
+          <w:rFonts w:ascii="Times New Roman" w:hAnsi="Times New Roman" w:eastAsia="宋体"/>
+          <w:b w:val="1"/>
+          <w:color w:val="000000"/>
+          <w:sz w:val="18"/>
+        </w:rPr>
+        <w:t xml:space="preserve">提出批内原子去重与 HMAC 组合加固方案。</w:t>
+      </w:r>
+      <w:r>
+        <w:rPr>
+          <w:rFonts w:ascii="Times New Roman" w:hAnsi="Times New Roman" w:eastAsia="宋体"/>
+          <w:b w:val="0"/>
+          <w:color w:val="000000"/>
+          <w:sz w:val="18"/>
+        </w:rPr>
+        <w:t xml:space="preserve"> 在批次处理前增加完整消息去重检查，阻断重复输入产生多个成功接收事件；进一步结合 HMAC 确认，通过形式化验证表明组合方案能够阻断相应攻击路径，同时保持正常密钥交换与批次处理能力。</w:t>
       </w:r>
     </w:p>
     <w:p>
@@ -3747,7 +3699,7 @@
           <w:color w:val="000000"/>
           <w:sz w:val="18"/>
         </w:rPr>
-        <w:t>，并非原协议新增加的算法接口。V6/V7 用于验证状态和生命周期约束，其中 V7 为固定四槽模型；批内重放与后续加固主要采用固定两槽模型。</w:t>
+        <w:t>，并非原协议新增加的算法接口。有界批次模型用于验证状态和生命周期约束；批内重放与后续加固采用固定两槽模型。</w:t>
       </w:r>
     </w:p>
     <w:p>
@@ -4158,33 +4110,17 @@
           <w:color w:val="000000"/>
           <w:sz w:val="18"/>
         </w:rPr>
-        <w:t xml:space="preserve"> ProVerif 中的全部密码检查。HMAC-only 模型增加确认消息及对应接受事件；影响模型另引入有条件的输出消费与符号安装层。独立的 RQ-v2 准入原型只比较消息和参与方坐标，其发送发生标识并非协议会话标识 </w:t>
-      </w:r>
-      <m:oMath>
-        <m:box>
-          <m:boxPr/>
-          <m:e>
-            <m:r>
-              <m:rPr/>
-              <w:rPr>
-                <w:rFonts w:ascii="Cambria Math" w:hAnsi="Cambria Math" w:eastAsia="宋体"/>
-                <w:color w:val="000000"/>
-                <w:sz w:val="18"/>
-              </w:rPr>
-              <m:t>sid</m:t>
-            </m:r>
-          </m:e>
-        </m:box>
-      </m:oMath>
-      <w:r>
-        <w:rPr>
-          <w:rFonts w:ascii="Times New Roman" w:hAnsi="Times New Roman" w:eastAsia="宋体"/>
-          <w:b w:val="0"/>
-          <w:i w:val="0"/>
-          <w:color w:val="000000"/>
-          <w:sz w:val="18"/>
-        </w:rPr>
-        <w:t>。这些理论的同名事件不能直接互换。</w:t>
+        <w:t xml:space="preserve"> ProVerif 中的全部密码检查。HMAC-only 模型增加确认消息及对应接受事件；影响模型另引入有条件的输出消费与符号安装层。</w:t>
+      </w:r>
+      <w:r>
+        <w:rPr>
+          <w:rFonts w:ascii="Times New Roman" w:hAnsi="Times New Roman" w:eastAsia="宋体"/>
+          <w:b w:val="0"/>
+          <w:i w:val="0"/>
+          <w:color w:val="000000"/>
+          <w:sz w:val="18"/>
+        </w:rPr>
+        <w:t>这些理论的同名事件不能直接互换。</w:t>
       </w:r>
     </w:p>
     <w:p>
@@ -6194,134 +6130,6 @@
             <w:tcBorders>
               <w:top w:val="nil"/>
               <w:left w:val="nil"/>
-              <w:bottom w:val="nil"/>
-              <w:right w:val="nil"/>
-              <w:insideH w:val="nil"/>
-              <w:insideV w:val="nil"/>
-            </w:tcBorders>
-            <w:vAlign w:val="center"/>
-          </w:tcPr>
-          <w:p>
-            <w:pPr>
-              <w:spacing w:before="0" w:after="0" w:line="190" w:lineRule="exact"/>
-              <w:jc w:val="left"/>
-            </w:pPr>
-            <w:r>
-              <w:rPr>
-                <w:rFonts w:ascii="Times New Roman" w:hAnsi="Times New Roman" w:eastAsia="宋体"/>
-                <w:b w:val="0"/>
-                <w:i w:val="0"/>
-                <w:color w:val="000000"/>
-                <w:sz w:val="15"/>
-              </w:rPr>
-              <w:t>P3</w:t>
-            </w:r>
-          </w:p>
-        </w:tc>
-        <w:tc>
-          <w:tcPr>
-            <w:tcW w:w="3288" w:type="dxa"/>
-            <w:tcBorders>
-              <w:top w:val="nil"/>
-              <w:left w:val="nil"/>
-              <w:bottom w:val="nil"/>
-              <w:right w:val="nil"/>
-              <w:insideH w:val="nil"/>
-              <w:insideV w:val="nil"/>
-            </w:tcBorders>
-            <w:vAlign w:val="center"/>
-          </w:tcPr>
-          <w:p>
-            <w:pPr>
-              <w:spacing w:before="0" w:after="0" w:line="190" w:lineRule="exact"/>
-              <w:jc w:val="left"/>
-            </w:pPr>
-            <w:r>
-              <w:t>同源输出的安装唯一性</w:t>
-            </w:r>
-          </w:p>
-        </w:tc>
-        <w:tc>
-          <w:tcPr>
-            <w:tcW w:w="1304" w:type="dxa"/>
-            <w:tcBorders>
-              <w:top w:val="nil"/>
-              <w:left w:val="nil"/>
-              <w:bottom w:val="nil"/>
-              <w:right w:val="nil"/>
-              <w:insideH w:val="nil"/>
-              <w:insideV w:val="nil"/>
-            </w:tcBorders>
-            <w:vAlign w:val="center"/>
-          </w:tcPr>
-          <w:p>
-            <w:pPr>
-              <w:spacing w:before="0" w:after="0" w:line="190" w:lineRule="exact"/>
-              <w:jc w:val="left"/>
-            </w:pPr>
-            <w:r>
-              <w:rPr>
-                <w:rFonts w:ascii="Times New Roman" w:hAnsi="Times New Roman" w:eastAsia="宋体"/>
-                <w:b w:val="0"/>
-                <w:i w:val="0"/>
-                <w:color w:val="000000"/>
-                <w:sz w:val="15"/>
-              </w:rPr>
-              <w:t>Tamarin</w:t>
-            </w:r>
-          </w:p>
-        </w:tc>
-        <w:tc>
-          <w:tcPr>
-            <w:tcW w:w="3288" w:type="dxa"/>
-            <w:tcBorders>
-              <w:top w:val="nil"/>
-              <w:left w:val="nil"/>
-              <w:bottom w:val="nil"/>
-              <w:right w:val="nil"/>
-              <w:insideH w:val="nil"/>
-              <w:insideV w:val="nil"/>
-            </w:tcBorders>
-            <w:vAlign w:val="center"/>
-          </w:tcPr>
-          <w:p>
-            <w:pPr>
-              <w:spacing w:before="0" w:after="0" w:line="190" w:lineRule="exact"/>
-              <w:jc w:val="left"/>
-            </w:pPr>
-            <w:r>
-              <w:rPr>
-                <w:rFonts w:ascii="Times New Roman" w:hAnsi="Times New Roman" w:eastAsia="宋体"/>
-                <w:b w:val="0"/>
-                <w:i w:val="0"/>
-                <w:color w:val="000000"/>
-                <w:sz w:val="15"/>
-              </w:rPr>
-              <w:t>条件化消费模型</w:t>
-            </w:r>
-          </w:p>
-        </w:tc>
-      </w:tr>
-      <w:tr>
-        <w:tblPrEx>
-          <w:tblCellMar>
-            <w:top w:w="0" w:type="dxa"/>
-            <w:left w:w="108" w:type="dxa"/>
-            <w:bottom w:w="0" w:type="dxa"/>
-            <w:right w:w="108" w:type="dxa"/>
-          </w:tblCellMar>
-        </w:tblPrEx>
-        <w:trPr>
-          <w:cantSplit/>
-          <w:trHeight w:val="0" w:hRule="atLeast"/>
-          <w:jc w:val="center"/>
-        </w:trPr>
-        <w:tc>
-          <w:tcPr>
-            <w:tcW w:w="1077" w:type="dxa"/>
-            <w:tcBorders>
-              <w:top w:val="nil"/>
-              <w:left w:val="nil"/>
               <w:bottom w:val="single" w:color="000000" w:sz="6" w:space="0"/>
               <w:right w:val="nil"/>
               <w:insideH w:val="nil"/>
@@ -6342,7 +6150,7 @@
                 <w:color w:val="000000"/>
                 <w:sz w:val="15"/>
               </w:rPr>
-              <w:t>参与方互异</w:t>
+              <w:t>P3</w:t>
             </w:r>
           </w:p>
         </w:tc>
@@ -6365,14 +6173,7 @@
               <w:jc w:val="left"/>
             </w:pPr>
             <w:r>
-              <w:rPr>
-                <w:rFonts w:ascii="Times New Roman" w:hAnsi="Times New Roman" w:eastAsia="宋体"/>
-                <w:b w:val="0"/>
-                <w:i w:val="0"/>
-                <w:color w:val="000000"/>
-                <w:sz w:val="15"/>
-              </w:rPr>
-              <w:t>同批不同槽位关联不同参与方</w:t>
+              <w:t>同源输出的安装唯一性</w:t>
             </w:r>
           </w:p>
         </w:tc>
@@ -6432,7 +6233,7 @@
                 <w:color w:val="000000"/>
                 <w:sz w:val="15"/>
               </w:rPr>
-              <w:t>独立准入原型</w:t>
+              <w:t>条件化消费模型</w:t>
             </w:r>
           </w:p>
         </w:tc>
@@ -6464,7 +6265,7 @@
           <w:color w:val="000000"/>
           <w:sz w:val="18"/>
         </w:rPr>
-        <w:t>表1概括两类工具的分工。ProVerif 负责单次核心过程的机密性及对应关系；Tamarin 负责有界状态化批次中的重复接受、条件化影响和准入比较。存在性见证与全称安全性质分别报告；后续各章仅在对应模型的范围内解释证明和反例，不将不同理论的事件拼接为未经验证的联合执行。</w:t>
+        <w:t>表1概括两类工具的分工。ProVerif 负责单次核心过程的机密性及对应关系；Tamarin 负责有界状态化批次中的重复接受、条件化影响。存在性见证与全称安全性质分别报告；后续各章仅在对应模型的范围内解释证明和反例，不将不同理论的事件拼接为未经验证的联合执行。</w:t>
       </w:r>
     </w:p>
     <w:p>
@@ -12668,7 +12469,7 @@
           <w:color w:val="000000"/>
           <w:sz w:val="18"/>
         </w:rPr>
-        <w:t>两个模型均保留原有的三组密钥封装、预密钥签名检查及会话密钥派生过程。加固变体在发送方增加确认标签生成，在接收方增加标签匹配检查，并使接收完成事件受确认结果约束；同时将发送完成事件安排在确认消息公开之前。</w:t>
+        <w:t xml:space="preserve">两个模型均保留原有的三组密钥封装、预密钥签名检查及会话密钥派生过程。加固变体在发送方增加确认标签生成，在接收方增加标签匹配检查，并使接收完成事件受确认结果约束。原始模型在基础密文消息公开之后记录发送完成事件；HMAC 加固模型在确认消息公开之前记录发送完成事件。原始模型与加固模型分别依据基础消息发送和确认消息发送过程设置发送完成观察点，相关对应关系验证结果应结合各自事件定义理解。</w:t>
       </w:r>
     </w:p>
     <w:p>
@@ -20781,7 +20582,7 @@
           <w:color w:val="000000"/>
           <w:sz w:val="18"/>
         </w:rPr>
-        <w:t xml:space="preserve">综上，本文通过在 BatchReceive 中增加处理前原子去重，并结合 HMAC 密钥确认，实现了对消息篡改和批内重复接受问题的分层加固。形式化验证表明，该方案能够有效阻断相应攻击路径，同时维持正常密钥交换和批次接收能力。</w:t>
+        <w:t xml:space="preserve">第3章的 ProVerif 验证表明，HMAC 密钥确认能够在无密钥泄露的核心模型中恢复完整会话参数对应关系。本节 Tamarin 验证进一步表明，在固定两槽批次模型中，原子去重与 HMAC 组合能够阻断相同消息的重复接受，并在指定消费条件下排除相应的重复安装路径，同时保留不同有效消息正常接收与消费的可达性。</w:t>
       </w:r>
     </w:p>
     <w:p>

</xml_diff>

<commit_message>
paper(word): insert approved Figure 1 into BatchReceive introduction
Embed the author-confirmed PNG unchanged at full text width, add the specified caption and explanation with editable m_j, and preserve all pre-existing body elements and package parts unrelated to the image. Visual WPS review is deferred at the author's request; natural pagination reflow remains to be checked.
</commit_message>
<xml_diff>
--- a/submissions/arocmag/word-final/K-Waay-AROCMAG-submission-working.docx
+++ b/submissions/arocmag/word-final/K-Waay-AROCMAG-submission-working.docx
@@ -2476,6 +2476,124 @@
           <w:szCs w:val="18"/>
         </w:rPr>
         <w:t>每个位置关联一个发送方身份材料、预密钥束及消息；接收结果按照相应位置组织为密钥或失败值。原构造既有条目级失败处理，也有特定解封装失败导致的批次级失败，因此槽位中的局部计算不能无条件等同于最终批次成功返回。</w:t>
+      </w:r>
+    </w:p>
+    <w:p>
+      <w:pPr>
+        <w:pStyle w:val="71"/>
+        <w:spacing w:before="0" w:after="0" w:line="20" w:lineRule="exact"/>
+        <w:ind w:firstLine="0" w:firstLineChars="0"/>
+        <w:sectPr>
+          <w:type w:val="continuous"/>
+          <w:pgSz w:w="11906" w:h="16838"/>
+          <w:pgMar w:top="1134" w:right="850" w:bottom="850" w:left="850" w:header="397" w:footer="397" w:gutter="0"/>
+          <w:cols w:space="360" w:num="2"/>
+          <w:docGrid w:type="linesAndChars" w:linePitch="322" w:charSpace="460"/>
+        </w:sectPr>
+      </w:pPr>
+    </w:p>
+    <w:p>
+      <w:pPr>
+        <w:pStyle w:val="77"/>
+        <w:jc w:val="center"/>
+        <w:keepNext w:val="1"/>
+        <w:snapToGrid w:val="0"/>
+        <w:spacing w:before="80" w:after="0" w:line="240" w:lineRule="auto"/>
+      </w:pPr>
+      <w:r>
+        <w:drawing>
+          <wp:inline xmlns:a="http://schemas.openxmlformats.org/drawingml/2006/main" xmlns:pic="http://schemas.openxmlformats.org/drawingml/2006/picture">
+            <wp:extent cx="6480810" cy="4860608"/>
+            <wp:docPr id="1" name="图1 K-Waay核心发送与批量接收流程" descr="K-Waay核心发送与批量接收流程"/>
+            <wp:cNvGraphicFramePr>
+              <a:graphicFrameLocks noChangeAspect="1"/>
+            </wp:cNvGraphicFramePr>
+            <a:graphic>
+              <a:graphicData uri="http://schemas.openxmlformats.org/drawingml/2006/picture">
+                <pic:pic>
+                  <pic:nvPicPr>
+                    <pic:cNvPr id="0" name="image.png"/>
+                    <pic:cNvPicPr/>
+                  </pic:nvPicPr>
+                  <pic:blipFill>
+                    <a:blip r:embed="rId10"/>
+                    <a:stretch>
+                      <a:fillRect/>
+                    </a:stretch>
+                  </pic:blipFill>
+                  <pic:spPr>
+                    <a:xfrm>
+                      <a:off x="0" y="0"/>
+                      <a:ext cx="6480810" cy="4860608"/>
+                    </a:xfrm>
+                    <a:prstGeom prst="rect"/>
+                  </pic:spPr>
+                </pic:pic>
+              </a:graphicData>
+            </a:graphic>
+          </wp:inline>
+        </w:drawing>
+      </w:r>
+    </w:p>
+    <w:p>
+      <w:pPr>
+        <w:pStyle w:val="77"/>
+        <w:jc w:val="center"/>
+        <w:keepNext w:val="0"/>
+        <w:spacing w:before="40" w:after="80" w:line="240" w:lineRule="auto"/>
+        <w:sectPr>
+          <w:type w:val="continuous"/>
+          <w:pgSz w:w="11906" w:h="16838"/>
+          <w:pgMar w:top="1134" w:right="850" w:bottom="850" w:left="850" w:header="397" w:footer="397" w:gutter="0"/>
+          <w:cols w:space="360" w:num="1"/>
+          <w:docGrid w:type="linesAndChars" w:linePitch="322" w:charSpace="460"/>
+        </w:sectPr>
+      </w:pPr>
+      <w:r>
+        <w:rPr>
+          <w:rFonts w:ascii="Times New Roman" w:hAnsi="Times New Roman" w:eastAsia="宋体"/>
+          <w:sz w:val="16"/>
+          <w:szCs w:val="16"/>
+        </w:rPr>
+        <w:t xml:space="preserve">图1 K-Waay核心发送与批量接收流程</w:t>
+      </w:r>
+    </w:p>
+    <w:p>
+      <w:pPr>
+        <w:pStyle w:val="71"/>
+        <w:spacing w:before="0" w:after="0" w:line="240" w:lineRule="exact"/>
+        <w:ind w:firstLine="360"/>
+        <w:jc w:val="both"/>
+      </w:pPr>
+      <w:r>
+        <w:rPr>
+          <w:rFonts w:ascii="Times New Roman" w:hAnsi="Times New Roman" w:eastAsia="宋体"/>
+          <w:sz w:val="18"/>
+          <w:szCs w:val="18"/>
+        </w:rPr>
+        <w:t xml:space="preserve">如图1所示，K-Waay首先由接收方生成长期密钥和预密钥材料，并通过公开信道发布预密钥束。发送方根据接收方公开材料生成临时密钥材料，并计算多个封装分量形成发送条目 </w:t>
+      </w:r>
+      <m:oMath>
+        <m:sSub>
+          <m:e>
+            <m:r>
+              <m:t>m</m:t>
+            </m:r>
+          </m:e>
+          <m:sub>
+            <m:r>
+              <m:t>j</m:t>
+            </m:r>
+          </m:sub>
+        </m:sSub>
+      </m:oMath>
+      <w:r>
+        <w:rPr>
+          <w:rFonts w:ascii="Times New Roman" w:hAnsi="Times New Roman" w:eastAsia="宋体"/>
+          <w:sz w:val="18"/>
+          <w:szCs w:val="18"/>
+        </w:rPr>
+        <w:t xml:space="preserve">。接收方上线后调用 BatchReceive，对共享接收状态下收集的多个发送条目进行统一处理，分别恢复密钥分量并通过 KDF 导出会话密钥。本文后续分析重点关注发送条目构造与 BatchReceive 处理过程中的安全属性。</w:t>
       </w:r>
     </w:p>
     <w:p>

</xml_diff>

<commit_message>
paper(word): insert approved ciphertext recomposition Figure 2
Place Figure 2 after the five attack steps and mismatch result in section 3.2, before cause analysis. Append only the reference sentence to the existing paragraph; preserve the supplied PNG, other text, formulas, tables, Figure 1 and all existing section settings. Final image sizing, pagination and WPS review are deferred at the author's request.
</commit_message>
<xml_diff>
--- a/submissions/arocmag/word-final/K-Waay-AROCMAG-submission-working.docx
+++ b/submissions/arocmag/word-final/K-Waay-AROCMAG-submission-working.docx
@@ -10823,6 +10823,77 @@
           <w:szCs w:val="18"/>
         </w:rPr>
         <w:t xml:space="preserve"> 仍执行了接收完成操作。</w:t>
+      </w:r>
+      <w:r>
+        <w:rPr>
+          <w:rFonts w:ascii="Times New Roman" w:hAnsi="Times New Roman" w:eastAsia="宋体" w:cs="Times New Roman"/>
+          <w:b w:val="0"/>
+          <w:bCs w:val="0"/>
+          <w:i w:val="0"/>
+          <w:color w:val="000000"/>
+          <w:sz w:val="18"/>
+          <w:szCs w:val="18"/>
+        </w:rPr>
+        <w:t>上述攻击过程如图2所示。</w:t>
+      </w:r>
+    </w:p>
+    <w:p>
+      <w:pPr>
+        <w:pStyle w:val="77"/>
+        <w:jc w:val="center"/>
+        <w:keepNext w:val="1"/>
+        <w:snapToGrid w:val="0"/>
+        <w:spacing w:before="80" w:after="0" w:line="240" w:lineRule="auto"/>
+      </w:pPr>
+      <w:r>
+        <w:drawing xmlns:mo="http://schemas.microsoft.com/office/mac/office/2008/main" xmlns:mv="urn:schemas-microsoft-com:mac:vml">
+          <wp:inline xmlns:a="http://schemas.openxmlformats.org/drawingml/2006/main" xmlns:pic="http://schemas.openxmlformats.org/drawingml/2006/picture">
+            <wp:extent cx="3126105" cy="2344579"/>
+            <wp:docPr id="2" name="图2 K-Waay密文重组攻击流程" descr="K-Waay密文重组攻击流程"/>
+            <wp:cNvGraphicFramePr>
+              <a:graphicFrameLocks noChangeAspect="1"/>
+            </wp:cNvGraphicFramePr>
+            <a:graphic>
+              <a:graphicData uri="http://schemas.openxmlformats.org/drawingml/2006/picture">
+                <pic:pic>
+                  <pic:nvPicPr>
+                    <pic:cNvPr id="0" name="image.png"/>
+                    <pic:cNvPicPr/>
+                  </pic:nvPicPr>
+                  <pic:blipFill>
+                    <a:blip r:embed="rId11"/>
+                    <a:stretch>
+                      <a:fillRect/>
+                    </a:stretch>
+                  </pic:blipFill>
+                  <pic:spPr>
+                    <a:xfrm>
+                      <a:off x="0" y="0"/>
+                      <a:ext cx="3126105" cy="2344579"/>
+                    </a:xfrm>
+                    <a:prstGeom prst="rect"/>
+                  </pic:spPr>
+                </pic:pic>
+              </a:graphicData>
+            </a:graphic>
+          </wp:inline>
+        </w:drawing>
+      </w:r>
+    </w:p>
+    <w:p>
+      <w:pPr>
+        <w:pStyle w:val="77"/>
+        <w:jc w:val="center"/>
+        <w:keepNext w:val="0"/>
+        <w:spacing w:before="40" w:after="80" w:line="240" w:lineRule="auto"/>
+      </w:pPr>
+      <w:r>
+        <w:rPr>
+          <w:rFonts w:ascii="Times New Roman" w:hAnsi="Times New Roman" w:eastAsia="宋体"/>
+          <w:sz w:val="16"/>
+          <w:szCs w:val="16"/>
+        </w:rPr>
+        <w:t>图2 K-Waay密文重组攻击流程</w:t>
       </w:r>
     </w:p>
     <w:p>

</xml_diff>

<commit_message>
paper(word): insert approved Figure 3 after conditional impact analysis
Replace the section 4.3.2 figure placeholder with the unchanged supplied PNG and a centered native SEQ Figure caption showing 3. Append one conditional-impact reference sentence only. Preserve prior figures, Figure 4 placeholder, academic text, formulas, tables and sections. WPS review and final layout remain deferred at the author's request.
</commit_message>
<xml_diff>
--- a/submissions/arocmag/word-final/K-Waay-AROCMAG-submission-working.docx
+++ b/submissions/arocmag/word-final/K-Waay-AROCMAG-submission-working.docx
@@ -18849,25 +18849,124 @@
         </w:rPr>
         <w:t>该结果是对重复接受安全影响的进一步验证，但其安装部分依赖明确的 C_install-v2 消费假设。这里使用的是独立的原始重复接收与消费组合模型，而非第4.2节 HMAC-only 模型的直接扩展，因此不将两个验证结果描述成同一条联合攻击轨迹，也不据此断言实际实现必然发生会话克隆。</w:t>
       </w:r>
+      <w:r>
+        <w:rPr>
+          <w:rFonts w:ascii="Times New Roman" w:hAnsi="Times New Roman" w:eastAsia="宋体" w:cs="Times New Roman"/>
+          <w:b w:val="0"/>
+          <w:bCs w:val="0"/>
+          <w:i w:val="0"/>
+          <w:color w:val="000000"/>
+          <w:sz w:val="18"/>
+          <w:szCs w:val="18"/>
+        </w:rPr>
+        <w:t>上述批内重复接受过程及其条件化安全影响如图3所示。</w:t>
+      </w:r>
     </w:p>
     <w:p>
       <w:pPr>
-        <w:pStyle w:val="71"/>
-        <w:spacing w:before="0" w:after="0" w:line="240" w:lineRule="exact"/>
-        <w:ind w:firstLine="360"/>
-        <w:jc w:val="left"/>
-      </w:pPr>
-      <w:r>
-        <w:rPr>
-          <w:rFonts w:ascii="Times New Roman" w:hAnsi="Times New Roman" w:eastAsia="宋体" w:cs="Times New Roman"/>
-          <w:b w:val="0"/>
-          <w:bCs w:val="0"/>
-          <w:i/>
-          <w:color w:val="000000"/>
-          <w:sz w:val="18"/>
-          <w:szCs w:val="18"/>
-        </w:rPr>
-        <w:t>【图3预留：批内重复接受与条件化重复安装攻击。】</w:t>
+        <w:pStyle w:val="77"/>
+        <w:jc w:val="center"/>
+        <w:keepNext w:val="1"/>
+        <w:snapToGrid w:val="0"/>
+        <w:spacing w:before="80" w:after="0" w:line="240" w:lineRule="auto"/>
+      </w:pPr>
+      <w:r>
+        <w:drawing xmlns:mo="http://schemas.microsoft.com/office/mac/office/2008/main" xmlns:mv="urn:schemas-microsoft-com:mac:vml">
+          <wp:inline xmlns:a="http://schemas.openxmlformats.org/drawingml/2006/main" xmlns:pic="http://schemas.openxmlformats.org/drawingml/2006/picture">
+            <wp:extent cx="3126105" cy="2344579"/>
+            <wp:docPr id="3" name="图3 K-Waay批内重复接受与安全影响示意" descr="K-Waay批内重复接受与安全影响示意"/>
+            <wp:cNvGraphicFramePr>
+              <a:graphicFrameLocks noChangeAspect="1"/>
+            </wp:cNvGraphicFramePr>
+            <a:graphic>
+              <a:graphicData uri="http://schemas.openxmlformats.org/drawingml/2006/picture">
+                <pic:pic>
+                  <pic:nvPicPr>
+                    <pic:cNvPr id="0" name="image.png"/>
+                    <pic:cNvPicPr/>
+                  </pic:nvPicPr>
+                  <pic:blipFill>
+                    <a:blip r:embed="rId12"/>
+                    <a:stretch>
+                      <a:fillRect/>
+                    </a:stretch>
+                  </pic:blipFill>
+                  <pic:spPr>
+                    <a:xfrm>
+                      <a:off x="0" y="0"/>
+                      <a:ext cx="3126105" cy="2344579"/>
+                    </a:xfrm>
+                    <a:prstGeom prst="rect"/>
+                  </pic:spPr>
+                </pic:pic>
+              </a:graphicData>
+            </a:graphic>
+          </wp:inline>
+        </w:drawing>
+      </w:r>
+    </w:p>
+    <w:p>
+      <w:pPr>
+        <w:pStyle w:val="77"/>
+        <w:jc w:val="center"/>
+        <w:keepNext w:val="0"/>
+        <w:spacing w:before="40" w:after="80" w:line="240" w:lineRule="auto"/>
+      </w:pPr>
+      <w:r>
+        <w:rPr>
+          <w:rFonts w:ascii="Times New Roman" w:hAnsi="Times New Roman" w:eastAsia="宋体"/>
+          <w:sz w:val="16"/>
+          <w:szCs w:val="16"/>
+        </w:rPr>
+        <w:t xml:space="preserve">图</w:t>
+      </w:r>
+      <w:r>
+        <w:rPr>
+          <w:rFonts w:ascii="Times New Roman" w:hAnsi="Times New Roman" w:eastAsia="宋体"/>
+          <w:sz w:val="16"/>
+          <w:szCs w:val="16"/>
+        </w:rPr>
+        <w:fldChar w:fldCharType="begin"/>
+      </w:r>
+      <w:r>
+        <w:rPr>
+          <w:rFonts w:ascii="Times New Roman" w:hAnsi="Times New Roman" w:eastAsia="宋体"/>
+          <w:sz w:val="16"/>
+          <w:szCs w:val="16"/>
+        </w:rPr>
+        <w:instrText xml:space="preserve"> SEQ Figure \r 3 \* ARABIC </w:instrText>
+      </w:r>
+      <w:r>
+        <w:rPr>
+          <w:rFonts w:ascii="Times New Roman" w:hAnsi="Times New Roman" w:eastAsia="宋体"/>
+          <w:sz w:val="16"/>
+          <w:szCs w:val="16"/>
+        </w:rPr>
+        <w:fldChar w:fldCharType="separate"/>
+      </w:r>
+      <w:r>
+        <w:rPr>
+          <w:rFonts w:ascii="Times New Roman" w:hAnsi="Times New Roman" w:eastAsia="宋体"/>
+          <w:sz w:val="16"/>
+          <w:szCs w:val="16"/>
+        </w:rPr>
+        <w:t xml:space="preserve">3</w:t>
+      </w:r>
+      <w:r>
+        <w:rPr>
+          <w:rFonts w:ascii="Times New Roman" w:hAnsi="Times New Roman" w:eastAsia="宋体"/>
+          <w:sz w:val="16"/>
+          <w:szCs w:val="16"/>
+        </w:rPr>
+        <w:fldChar w:fldCharType="end"/>
+      </w:r>
+      <w:r>
+        <w:rPr>
+          <w:rFonts w:ascii="Times New Roman" w:hAnsi="Times New Roman" w:eastAsia="宋体"/>
+          <w:sz w:val="16"/>
+          <w:szCs w:val="16"/>
+        </w:rPr>
+        <w:t xml:space="preserve"> K-Waay批内重复接受与安全影响示意</w:t>
       </w:r>
     </w:p>
     <w:p>

</xml_diff>